<commit_message>
Retake the walkthrough screenshots with the player named JIHAN
The screenshots in docs/Thunder_Yellow_Walkthrough.docx were taken with a test
save named AAAAAAA. They are now taken again from a save named JIHAN, with the
starter PIKACHU's OT name changed to match so it is still recognized as the
starter and follows the player as in normal play.

Co-Authored-By: Claude Opus 5 (1M context) <noreply@anthropic.com>
</commit_message>
<xml_diff>
--- a/docs/Thunder_Yellow_Walkthrough.docx
+++ b/docs/Thunder_Yellow_Walkthrough.docx
@@ -2560,7 +2560,7 @@
                 <wp:inline distT="0" distB="0" distL="0" distR="0">
                   <wp:extent cx="2971800" cy="1981200"/>
                   <wp:effectExtent t="0" r="0" b="0" l="0"/>
-                  <wp:docPr id="1" name="0107_battle.png" descr="호수 위의 파란 포켓몬 = 마릴 Lv35" title="호수 위의 파란 포켓몬 = 마릴 Lv35"/>
+                  <wp:docPr id="1" name="0065_battle.png" descr="호수 위의 파란 포켓몬 = 마릴 Lv35" title="호수 위의 파란 포켓몬 = 마릴 Lv35"/>
                   <wp:cNvGraphicFramePr>
                     <a:graphicFrameLocks xmlns:a="http://schemas.openxmlformats.org/drawingml/2006/main" noChangeAspect="1"/>
                   </wp:cNvGraphicFramePr>
@@ -6123,7 +6123,7 @@
                 <wp:inline distT="0" distB="0" distL="0" distR="0">
                   <wp:extent cx="2971800" cy="1981200"/>
                   <wp:effectExtent t="0" r="0" b="0" l="0"/>
-                  <wp:docPr id="1" name="0027.png" descr="보상: 기술머신40" title="보상: 기술머신40"/>
+                  <wp:docPr id="1" name="0029.png" descr="친구의 보상: 기술머신40 에어리얼에이스" title="친구의 보상: 기술머신40 에어리얼에이스"/>
                   <wp:cNvGraphicFramePr>
                     <a:graphicFrameLocks xmlns:a="http://schemas.openxmlformats.org/drawingml/2006/main" noChangeAspect="1"/>
                   </wp:cNvGraphicFramePr>
@@ -6171,7 +6171,7 @@
                 <w:sz w:val="18"/>
                 <w:szCs w:val="18"/>
               </w:rPr>
-              <w:t xml:space="preserve">보상: 기술머신40</w:t>
+              <w:t xml:space="preserve">친구의 보상: 기술머신40 에어리얼에이스</w:t>
             </w:r>
           </w:p>
         </w:tc>
@@ -7951,7 +7951,7 @@
                 <wp:inline distT="0" distB="0" distL="0" distR="0">
                   <wp:extent cx="2971800" cy="1981200"/>
                   <wp:effectExtent t="0" r="0" b="0" l="0"/>
-                  <wp:docPr id="1" name="0015_oak.png" descr="흔들리며 메타몽으로 변신" title="흔들리며 메타몽으로 변신"/>
+                  <wp:docPr id="1" name="0014_oak.png" descr="흔들리며 메타몽으로 변신" title="흔들리며 메타몽으로 변신"/>
                   <wp:cNvGraphicFramePr>
                     <a:graphicFrameLocks xmlns:a="http://schemas.openxmlformats.org/drawingml/2006/main" noChangeAspect="1"/>
                   </wp:cNvGraphicFramePr>
@@ -11480,7 +11480,7 @@
                 <wp:inline distT="0" distB="0" distL="0" distR="0">
                   <wp:extent cx="2971800" cy="1981200"/>
                   <wp:effectExtent t="0" r="0" b="0" l="0"/>
-                  <wp:docPr id="1" name="0016_oak.png" descr="가운을 벗는 오박사" title="가운을 벗는 오박사"/>
+                  <wp:docPr id="1" name="0015_oak.png" descr="가운을 벗는 오박사" title="가운을 벗는 오박사"/>
                   <wp:cNvGraphicFramePr>
                     <a:graphicFrameLocks xmlns:a="http://schemas.openxmlformats.org/drawingml/2006/main" noChangeAspect="1"/>
                   </wp:cNvGraphicFramePr>
@@ -11562,7 +11562,7 @@
                 <wp:inline distT="0" distB="0" distL="0" distR="0">
                   <wp:extent cx="2971800" cy="1981200"/>
                   <wp:effectExtent t="0" r="0" b="0" l="0"/>
-                  <wp:docPr id="1" name="0021_battle.png" descr="오박사와의 배틀 시작" title="오박사와의 배틀 시작"/>
+                  <wp:docPr id="1" name="0020_battle.png" descr="오박사와의 배틀 시작" title="오박사와의 배틀 시작"/>
                   <wp:cNvGraphicFramePr>
                     <a:graphicFrameLocks xmlns:a="http://schemas.openxmlformats.org/drawingml/2006/main" noChangeAspect="1"/>
                   </wp:cNvGraphicFramePr>
@@ -11639,7 +11639,7 @@
                 <wp:inline distT="0" distB="0" distL="0" distR="0">
                   <wp:extent cx="2971800" cy="1981200"/>
                   <wp:effectExtent t="0" r="0" b="0" l="0"/>
-                  <wp:docPr id="1" name="0023_after.png" descr="승리 후 오른쪽 위에 놓인 금색 트로피" title="승리 후 오른쪽 위에 놓인 금색 트로피"/>
+                  <wp:docPr id="1" name="0022_after.png" descr="승리 후 오른쪽 위에 놓인 금색 트로피" title="승리 후 오른쪽 위에 놓인 금색 트로피"/>
                   <wp:cNvGraphicFramePr>
                     <a:graphicFrameLocks xmlns:a="http://schemas.openxmlformats.org/drawingml/2006/main" noChangeAspect="1"/>
                   </wp:cNvGraphicFramePr>

</xml_diff>